<commit_message>
updating figures with new study and style
</commit_message>
<xml_diff>
--- a/outputs/tables/Supp_Table1_GPS_Methodology_Dictionaries.docx
+++ b/outputs/tables/Supp_Table1_GPS_Methodology_Dictionaries.docx
@@ -854,7 +854,7 @@
                 <w:szCs w:val="18"/>
                 <w:color w:val="000000"/>
               </w:rPr>
-              <w:t xml:space="preserve">9 (16.1%)</w:t>
+              <w:t xml:space="preserve">9 (15.8%)</w:t>
             </w:r>
           </w:p>
         </w:tc>
@@ -958,7 +958,7 @@
                 <w:szCs w:val="18"/>
                 <w:color w:val="000000"/>
               </w:rPr>
-              <w:t xml:space="preserve">8 (18.6%)</w:t>
+              <w:t xml:space="preserve">8 (18.2%)</w:t>
             </w:r>
           </w:p>
         </w:tc>
@@ -1114,7 +1114,7 @@
                 <w:szCs w:val="18"/>
                 <w:color w:val="000000"/>
               </w:rPr>
-              <w:t xml:space="preserve">2 (8.3%)</w:t>
+              <w:t xml:space="preserve">2 (8.0%)</w:t>
             </w:r>
           </w:p>
         </w:tc>
@@ -1276,7 +1276,7 @@
                 <w:szCs w:val="18"/>
                 <w:color w:val="000000"/>
               </w:rPr>
-              <w:t xml:space="preserve">6 (10.7%)</w:t>
+              <w:t xml:space="preserve">6 (10.5%)</w:t>
             </w:r>
           </w:p>
         </w:tc>
@@ -1380,7 +1380,7 @@
                 <w:szCs w:val="18"/>
                 <w:color w:val="000000"/>
               </w:rPr>
-              <w:t xml:space="preserve">6 (14.0%)</w:t>
+              <w:t xml:space="preserve">6 (13.6%)</w:t>
             </w:r>
           </w:p>
         </w:tc>
@@ -1536,7 +1536,7 @@
                 <w:szCs w:val="18"/>
                 <w:color w:val="000000"/>
               </w:rPr>
-              <w:t xml:space="preserve">2 (8.3%)</w:t>
+              <w:t xml:space="preserve">2 (8.0%)</w:t>
             </w:r>
           </w:p>
         </w:tc>
@@ -1698,7 +1698,7 @@
                 <w:szCs w:val="18"/>
                 <w:color w:val="000000"/>
               </w:rPr>
-              <w:t xml:space="preserve">2 (3.6%)</w:t>
+              <w:t xml:space="preserve">2 (3.5%)</w:t>
             </w:r>
           </w:p>
         </w:tc>
@@ -1802,7 +1802,7 @@
                 <w:szCs w:val="18"/>
                 <w:color w:val="000000"/>
               </w:rPr>
-              <w:t xml:space="preserve">2 (4.7%)</w:t>
+              <w:t xml:space="preserve">2 (4.5%)</w:t>
             </w:r>
           </w:p>
         </w:tc>
@@ -1958,7 +1958,7 @@
                 <w:szCs w:val="18"/>
                 <w:color w:val="000000"/>
               </w:rPr>
-              <w:t xml:space="preserve">1 (4.2%)</w:t>
+              <w:t xml:space="preserve">1 (4.0%)</w:t>
             </w:r>
           </w:p>
         </w:tc>
@@ -2120,7 +2120,7 @@
                 <w:szCs w:val="18"/>
                 <w:color w:val="000000"/>
               </w:rPr>
-              <w:t xml:space="preserve">2 (3.6%)</w:t>
+              <w:t xml:space="preserve">2 (3.5%)</w:t>
             </w:r>
           </w:p>
         </w:tc>
@@ -2224,7 +2224,7 @@
                 <w:szCs w:val="18"/>
                 <w:color w:val="000000"/>
               </w:rPr>
-              <w:t xml:space="preserve">2 (4.7%)</w:t>
+              <w:t xml:space="preserve">2 (4.5%)</w:t>
             </w:r>
           </w:p>
         </w:tc>
@@ -2380,7 +2380,7 @@
                 <w:szCs w:val="18"/>
                 <w:color w:val="000000"/>
               </w:rPr>
-              <w:t xml:space="preserve">1 (4.2%)</w:t>
+              <w:t xml:space="preserve">1 (4.0%)</w:t>
             </w:r>
           </w:p>
         </w:tc>
@@ -2802,7 +2802,7 @@
                 <w:szCs w:val="18"/>
                 <w:color w:val="000000"/>
               </w:rPr>
-              <w:t xml:space="preserve">1 (4.2%)</w:t>
+              <w:t xml:space="preserve">1 (4.0%)</w:t>
             </w:r>
           </w:p>
         </w:tc>
@@ -3646,7 +3646,7 @@
                 <w:szCs w:val="18"/>
                 <w:color w:val="000000"/>
               </w:rPr>
-              <w:t xml:space="preserve">1 (4.2%)</w:t>
+              <w:t xml:space="preserve">1 (4.0%)</w:t>
             </w:r>
           </w:p>
         </w:tc>
@@ -3891,7 +3891,7 @@
                 <w:szCs w:val="18"/>
                 <w:color w:val="000000"/>
               </w:rPr>
-              <w:t xml:space="preserve">22 (39.3%)</w:t>
+              <w:t xml:space="preserve">22 (38.6%)</w:t>
             </w:r>
           </w:p>
         </w:tc>
@@ -3995,7 +3995,7 @@
                 <w:szCs w:val="18"/>
                 <w:color w:val="000000"/>
               </w:rPr>
-              <w:t xml:space="preserve">16 (37.2%)</w:t>
+              <w:t xml:space="preserve">16 (36.4%)</w:t>
             </w:r>
           </w:p>
         </w:tc>
@@ -4151,7 +4151,7 @@
                 <w:szCs w:val="18"/>
                 <w:color w:val="000000"/>
               </w:rPr>
-              <w:t xml:space="preserve">13 (54.2%)</w:t>
+              <w:t xml:space="preserve">13 (52.0%)</w:t>
             </w:r>
           </w:p>
         </w:tc>
@@ -4313,7 +4313,7 @@
                 <w:szCs w:val="18"/>
                 <w:color w:val="000000"/>
               </w:rPr>
-              <w:t xml:space="preserve">14 (25.0%)</w:t>
+              <w:t xml:space="preserve">15 (26.3%)</w:t>
             </w:r>
           </w:p>
         </w:tc>
@@ -4735,7 +4735,7 @@
                 <w:szCs w:val="18"/>
                 <w:color w:val="000000"/>
               </w:rPr>
-              <w:t xml:space="preserve">11 (19.6%)</w:t>
+              <w:t xml:space="preserve">12 (21.1%)</w:t>
             </w:r>
           </w:p>
         </w:tc>
@@ -4839,7 +4839,7 @@
                 <w:szCs w:val="18"/>
                 <w:color w:val="000000"/>
               </w:rPr>
-              <w:t xml:space="preserve">8 (18.6%)</w:t>
+              <w:t xml:space="preserve">9 (20.5%)</w:t>
             </w:r>
           </w:p>
         </w:tc>
@@ -4995,7 +4995,7 @@
                 <w:szCs w:val="18"/>
                 <w:color w:val="000000"/>
               </w:rPr>
-              <w:t xml:space="preserve">6 (25.0%)</w:t>
+              <w:t xml:space="preserve">7 (28.0%)</w:t>
             </w:r>
           </w:p>
         </w:tc>
@@ -5157,7 +5157,7 @@
                 <w:szCs w:val="18"/>
                 <w:color w:val="000000"/>
               </w:rPr>
-              <w:t xml:space="preserve">11 (19.6%)</w:t>
+              <w:t xml:space="preserve">11 (19.3%)</w:t>
             </w:r>
           </w:p>
         </w:tc>
@@ -5579,7 +5579,7 @@
                 <w:szCs w:val="18"/>
                 <w:color w:val="000000"/>
               </w:rPr>
-              <w:t xml:space="preserve">7 (12.5%)</w:t>
+              <w:t xml:space="preserve">7 (12.3%)</w:t>
             </w:r>
           </w:p>
         </w:tc>
@@ -5683,7 +5683,7 @@
                 <w:szCs w:val="18"/>
                 <w:color w:val="000000"/>
               </w:rPr>
-              <w:t xml:space="preserve">4 (9.3%)</w:t>
+              <w:t xml:space="preserve">4 (9.1%)</w:t>
             </w:r>
           </w:p>
         </w:tc>
@@ -5839,7 +5839,7 @@
                 <w:szCs w:val="18"/>
                 <w:color w:val="000000"/>
               </w:rPr>
-              <w:t xml:space="preserve">1 (4.2%)</w:t>
+              <w:t xml:space="preserve">1 (4.0%)</w:t>
             </w:r>
           </w:p>
         </w:tc>
@@ -6084,7 +6084,7 @@
                 <w:szCs w:val="18"/>
                 <w:color w:val="000000"/>
               </w:rPr>
-              <w:t xml:space="preserve">12 (21.4%)</w:t>
+              <w:t xml:space="preserve">12 (21.1%)</w:t>
             </w:r>
           </w:p>
         </w:tc>
@@ -6188,7 +6188,7 @@
                 <w:szCs w:val="18"/>
                 <w:color w:val="000000"/>
               </w:rPr>
-              <w:t xml:space="preserve">12 (27.9%)</w:t>
+              <w:t xml:space="preserve">12 (27.3%)</w:t>
             </w:r>
           </w:p>
         </w:tc>
@@ -6344,7 +6344,7 @@
                 <w:szCs w:val="18"/>
                 <w:color w:val="000000"/>
               </w:rPr>
-              <w:t xml:space="preserve">4 (16.7%)</w:t>
+              <w:t xml:space="preserve">4 (16.0%)</w:t>
             </w:r>
           </w:p>
         </w:tc>
@@ -6506,7 +6506,7 @@
                 <w:szCs w:val="18"/>
                 <w:color w:val="000000"/>
               </w:rPr>
-              <w:t xml:space="preserve">4 (7.1%)</w:t>
+              <w:t xml:space="preserve">4 (7.0%)</w:t>
             </w:r>
           </w:p>
         </w:tc>
@@ -6610,7 +6610,7 @@
                 <w:szCs w:val="18"/>
                 <w:color w:val="000000"/>
               </w:rPr>
-              <w:t xml:space="preserve">4 (9.3%)</w:t>
+              <w:t xml:space="preserve">4 (9.1%)</w:t>
             </w:r>
           </w:p>
         </w:tc>
@@ -6766,7 +6766,7 @@
                 <w:szCs w:val="18"/>
                 <w:color w:val="000000"/>
               </w:rPr>
-              <w:t xml:space="preserve">4 (16.7%)</w:t>
+              <w:t xml:space="preserve">4 (16.0%)</w:t>
             </w:r>
           </w:p>
         </w:tc>
@@ -7855,7 +7855,7 @@
                 <w:szCs w:val="18"/>
                 <w:color w:val="000000"/>
               </w:rPr>
-              <w:t xml:space="preserve">14 (25.0%)</w:t>
+              <w:t xml:space="preserve">15 (26.3%)</w:t>
             </w:r>
           </w:p>
         </w:tc>
@@ -7959,7 +7959,7 @@
                 <w:szCs w:val="18"/>
                 <w:color w:val="000000"/>
               </w:rPr>
-              <w:t xml:space="preserve">12 (27.9%)</w:t>
+              <w:t xml:space="preserve">13 (29.5%)</w:t>
             </w:r>
           </w:p>
         </w:tc>
@@ -8115,7 +8115,7 @@
                 <w:szCs w:val="18"/>
                 <w:color w:val="000000"/>
               </w:rPr>
-              <w:t xml:space="preserve">6 (25.0%)</w:t>
+              <w:t xml:space="preserve">7 (28.0%)</w:t>
             </w:r>
           </w:p>
         </w:tc>
@@ -8225,371 +8225,371 @@
                 <w:szCs w:val="18"/>
                 <w:color w:val="000000"/>
               </w:rPr>
-              <w:t xml:space="preserve">Accuracy Constraints</w:t>
-            </w:r>
-          </w:p>
-        </w:tc>
-        <w:tc>
-          <w:tcPr>
-            <w:tcBorders>
-              <w:bottom w:val="none" w:sz="0" w:space="0" w:color="000000"/>
-              <w:top w:val="none" w:sz="0" w:space="0" w:color="000000"/>
-              <w:left w:val="none" w:sz="0" w:space="0" w:color="000000"/>
-              <w:right w:val="none" w:sz="0" w:space="0" w:color="000000"/>
-            </w:tcBorders>
-            <w:shd w:val="clear" w:color="auto" w:fill="FFFFFF"/>
-            <w:tcMar>
-              <w:top w:w="0" w:type="dxa"/>
-              <w:bottom w:w="0" w:type="dxa"/>
-              <w:left w:w="0" w:type="dxa"/>
-              <w:right w:w="0" w:type="dxa"/>
-            </w:tcMar>
-            <w:vAlign w:val="center"/>
-          </w:tcPr>
-          <w:p>
-            <w:pPr>
-              <w:jc w:val="left"/>
-              <w:pBdr>
-                <w:bottom w:val="none" w:sz="0" w:space="0" w:color="000000"/>
-                <w:top w:val="none" w:sz="0" w:space="0" w:color="000000"/>
-                <w:left w:val="none" w:sz="0" w:space="0" w:color="000000"/>
-                <w:right w:val="none" w:sz="0" w:space="0" w:color="000000"/>
-              </w:pBdr>
-              <w:spacing w:after="100" w:before="100" w:line="240"/>
-              <w:ind w:left="100" w:right="100" w:firstLine="0" w:firstLineChars="0"/>
-              <w:rPr>
-                <w:rFonts w:ascii="Arial" w:hAnsi="Arial" w:eastAsia="Arial" w:cs="Arial"/>
-                <w:i w:val="false"/>
-                <w:b w:val="false"/>
-                <w:u w:val="none"/>
-                <w:sz w:val="18"/>
-                <w:szCs w:val="18"/>
-                <w:color w:val="000000"/>
-              </w:rPr>
-            </w:pPr>
-            <w:r>
-              <w:rPr>
-                <w:rFonts w:ascii="Arial" w:hAnsi="Arial" w:eastAsia="Arial" w:cs="Arial"/>
-                <w:i w:val="false"/>
-                <w:b w:val="false"/>
-                <w:u w:val="none"/>
-                <w:sz w:val="18"/>
-                <w:szCs w:val="18"/>
-                <w:color w:val="000000"/>
-              </w:rPr>
-              <w:t xml:space="preserve">14 (25.0%)</w:t>
-            </w:r>
-          </w:p>
-        </w:tc>
-        <w:tc>
-          <w:tcPr>
-            <w:tcBorders>
-              <w:bottom w:val="none" w:sz="0" w:space="0" w:color="000000"/>
-              <w:top w:val="none" w:sz="0" w:space="0" w:color="000000"/>
-              <w:left w:val="none" w:sz="0" w:space="0" w:color="000000"/>
-              <w:right w:val="none" w:sz="0" w:space="0" w:color="000000"/>
-            </w:tcBorders>
-            <w:shd w:val="clear" w:color="auto" w:fill="FFFFFF"/>
-            <w:tcMar>
-              <w:top w:w="0" w:type="dxa"/>
-              <w:bottom w:w="0" w:type="dxa"/>
-              <w:left w:w="0" w:type="dxa"/>
-              <w:right w:w="0" w:type="dxa"/>
-            </w:tcMar>
-            <w:vAlign w:val="center"/>
-          </w:tcPr>
-          <w:p>
-            <w:pPr>
-              <w:jc w:val="left"/>
-              <w:pBdr>
-                <w:bottom w:val="none" w:sz="0" w:space="0" w:color="000000"/>
-                <w:top w:val="none" w:sz="0" w:space="0" w:color="000000"/>
-                <w:left w:val="none" w:sz="0" w:space="0" w:color="000000"/>
-                <w:right w:val="none" w:sz="0" w:space="0" w:color="000000"/>
-              </w:pBdr>
-              <w:spacing w:after="100" w:before="100" w:line="240"/>
-              <w:ind w:left="100" w:right="100" w:firstLine="0" w:firstLineChars="0"/>
-              <w:rPr>
-                <w:rFonts w:ascii="Arial" w:hAnsi="Arial" w:eastAsia="Arial" w:cs="Arial"/>
-                <w:i w:val="false"/>
-                <w:b w:val="false"/>
-                <w:u w:val="none"/>
-                <w:sz w:val="18"/>
-                <w:szCs w:val="18"/>
-                <w:color w:val="000000"/>
-              </w:rPr>
-            </w:pPr>
-            <w:r>
-              <w:rPr>
-                <w:rFonts w:ascii="Arial" w:hAnsi="Arial" w:eastAsia="Arial" w:cs="Arial"/>
-                <w:i w:val="false"/>
-                <w:b w:val="false"/>
-                <w:u w:val="none"/>
-                <w:sz w:val="18"/>
-                <w:szCs w:val="18"/>
-                <w:color w:val="000000"/>
-              </w:rPr>
-              <w:t xml:space="preserve">1 (25.0%)</w:t>
-            </w:r>
-          </w:p>
-        </w:tc>
-        <w:tc>
-          <w:tcPr>
-            <w:tcBorders>
-              <w:bottom w:val="none" w:sz="0" w:space="0" w:color="000000"/>
-              <w:top w:val="none" w:sz="0" w:space="0" w:color="000000"/>
-              <w:left w:val="none" w:sz="0" w:space="0" w:color="000000"/>
-              <w:right w:val="none" w:sz="0" w:space="0" w:color="000000"/>
-            </w:tcBorders>
-            <w:shd w:val="clear" w:color="auto" w:fill="FFFFFF"/>
-            <w:tcMar>
-              <w:top w:w="0" w:type="dxa"/>
-              <w:bottom w:w="0" w:type="dxa"/>
-              <w:left w:w="0" w:type="dxa"/>
-              <w:right w:w="0" w:type="dxa"/>
-            </w:tcMar>
-            <w:vAlign w:val="center"/>
-          </w:tcPr>
-          <w:p>
-            <w:pPr>
-              <w:jc w:val="left"/>
-              <w:pBdr>
-                <w:bottom w:val="none" w:sz="0" w:space="0" w:color="000000"/>
-                <w:top w:val="none" w:sz="0" w:space="0" w:color="000000"/>
-                <w:left w:val="none" w:sz="0" w:space="0" w:color="000000"/>
-                <w:right w:val="none" w:sz="0" w:space="0" w:color="000000"/>
-              </w:pBdr>
-              <w:spacing w:after="100" w:before="100" w:line="240"/>
-              <w:ind w:left="100" w:right="100" w:firstLine="0" w:firstLineChars="0"/>
-              <w:rPr>
-                <w:rFonts w:ascii="Arial" w:hAnsi="Arial" w:eastAsia="Arial" w:cs="Arial"/>
-                <w:i w:val="false"/>
-                <w:b w:val="false"/>
-                <w:u w:val="none"/>
-                <w:sz w:val="18"/>
-                <w:szCs w:val="18"/>
-                <w:color w:val="000000"/>
-              </w:rPr>
-            </w:pPr>
-            <w:r>
-              <w:rPr>
-                <w:rFonts w:ascii="Arial" w:hAnsi="Arial" w:eastAsia="Arial" w:cs="Arial"/>
-                <w:i w:val="false"/>
-                <w:b w:val="false"/>
-                <w:u w:val="none"/>
-                <w:sz w:val="18"/>
-                <w:szCs w:val="18"/>
-                <w:color w:val="000000"/>
-              </w:rPr>
-              <w:t xml:space="preserve">12 (27.9%)</w:t>
-            </w:r>
-          </w:p>
-        </w:tc>
-        <w:tc>
-          <w:tcPr>
-            <w:tcBorders>
-              <w:bottom w:val="none" w:sz="0" w:space="0" w:color="000000"/>
-              <w:top w:val="none" w:sz="0" w:space="0" w:color="000000"/>
-              <w:left w:val="none" w:sz="0" w:space="0" w:color="000000"/>
-              <w:right w:val="none" w:sz="0" w:space="0" w:color="000000"/>
-            </w:tcBorders>
-            <w:shd w:val="clear" w:color="auto" w:fill="FFFFFF"/>
-            <w:tcMar>
-              <w:top w:w="0" w:type="dxa"/>
-              <w:bottom w:w="0" w:type="dxa"/>
-              <w:left w:w="0" w:type="dxa"/>
-              <w:right w:w="0" w:type="dxa"/>
-            </w:tcMar>
-            <w:vAlign w:val="center"/>
-          </w:tcPr>
-          <w:p>
-            <w:pPr>
-              <w:jc w:val="left"/>
-              <w:pBdr>
-                <w:bottom w:val="none" w:sz="0" w:space="0" w:color="000000"/>
-                <w:top w:val="none" w:sz="0" w:space="0" w:color="000000"/>
-                <w:left w:val="none" w:sz="0" w:space="0" w:color="000000"/>
-                <w:right w:val="none" w:sz="0" w:space="0" w:color="000000"/>
-              </w:pBdr>
-              <w:spacing w:after="100" w:before="100" w:line="240"/>
-              <w:ind w:left="100" w:right="100" w:firstLine="0" w:firstLineChars="0"/>
-              <w:rPr>
-                <w:rFonts w:ascii="Arial" w:hAnsi="Arial" w:eastAsia="Arial" w:cs="Arial"/>
-                <w:i w:val="false"/>
-                <w:b w:val="false"/>
-                <w:u w:val="none"/>
-                <w:sz w:val="18"/>
-                <w:szCs w:val="18"/>
-                <w:color w:val="000000"/>
-              </w:rPr>
-            </w:pPr>
-            <w:r>
-              <w:rPr>
-                <w:rFonts w:ascii="Arial" w:hAnsi="Arial" w:eastAsia="Arial" w:cs="Arial"/>
-                <w:i w:val="false"/>
-                <w:b w:val="false"/>
-                <w:u w:val="none"/>
-                <w:sz w:val="18"/>
-                <w:szCs w:val="18"/>
-                <w:color w:val="000000"/>
-              </w:rPr>
-              <w:t xml:space="preserve">1 (11.1%)</w:t>
-            </w:r>
-          </w:p>
-        </w:tc>
-        <w:tc>
-          <w:tcPr>
-            <w:tcBorders>
-              <w:bottom w:val="none" w:sz="0" w:space="0" w:color="000000"/>
-              <w:top w:val="none" w:sz="0" w:space="0" w:color="000000"/>
-              <w:left w:val="none" w:sz="0" w:space="0" w:color="000000"/>
-              <w:right w:val="none" w:sz="0" w:space="0" w:color="000000"/>
-            </w:tcBorders>
-            <w:shd w:val="clear" w:color="auto" w:fill="FFFFFF"/>
-            <w:tcMar>
-              <w:top w:w="0" w:type="dxa"/>
-              <w:bottom w:w="0" w:type="dxa"/>
-              <w:left w:w="0" w:type="dxa"/>
-              <w:right w:w="0" w:type="dxa"/>
-            </w:tcMar>
-            <w:vAlign w:val="center"/>
-          </w:tcPr>
-          <w:p>
-            <w:pPr>
-              <w:jc w:val="left"/>
-              <w:pBdr>
-                <w:bottom w:val="none" w:sz="0" w:space="0" w:color="000000"/>
-                <w:top w:val="none" w:sz="0" w:space="0" w:color="000000"/>
-                <w:left w:val="none" w:sz="0" w:space="0" w:color="000000"/>
-                <w:right w:val="none" w:sz="0" w:space="0" w:color="000000"/>
-              </w:pBdr>
-              <w:spacing w:after="100" w:before="100" w:line="240"/>
-              <w:ind w:left="100" w:right="100" w:firstLine="0" w:firstLineChars="0"/>
-              <w:rPr>
-                <w:rFonts w:ascii="Arial" w:hAnsi="Arial" w:eastAsia="Arial" w:cs="Arial"/>
-                <w:i w:val="false"/>
-                <w:b w:val="false"/>
-                <w:u w:val="none"/>
-                <w:sz w:val="18"/>
-                <w:szCs w:val="18"/>
-                <w:color w:val="000000"/>
-              </w:rPr>
-            </w:pPr>
-            <w:r>
-              <w:rPr>
-                <w:rFonts w:ascii="Arial" w:hAnsi="Arial" w:eastAsia="Arial" w:cs="Arial"/>
-                <w:i w:val="false"/>
-                <w:b w:val="false"/>
-                <w:u w:val="none"/>
-                <w:sz w:val="18"/>
-                <w:szCs w:val="18"/>
-                <w:color w:val="000000"/>
-              </w:rPr>
-              <w:t xml:space="preserve">7 (50.0%)</w:t>
-            </w:r>
-          </w:p>
-        </w:tc>
-        <w:tc>
-          <w:tcPr>
-            <w:tcBorders>
-              <w:bottom w:val="none" w:sz="0" w:space="0" w:color="000000"/>
-              <w:top w:val="none" w:sz="0" w:space="0" w:color="000000"/>
-              <w:left w:val="none" w:sz="0" w:space="0" w:color="000000"/>
-              <w:right w:val="none" w:sz="0" w:space="0" w:color="000000"/>
-            </w:tcBorders>
-            <w:shd w:val="clear" w:color="auto" w:fill="FFFFFF"/>
-            <w:tcMar>
-              <w:top w:w="0" w:type="dxa"/>
-              <w:bottom w:w="0" w:type="dxa"/>
-              <w:left w:w="0" w:type="dxa"/>
-              <w:right w:w="0" w:type="dxa"/>
-            </w:tcMar>
-            <w:vAlign w:val="center"/>
-          </w:tcPr>
-          <w:p>
-            <w:pPr>
-              <w:jc w:val="left"/>
-              <w:pBdr>
-                <w:bottom w:val="none" w:sz="0" w:space="0" w:color="000000"/>
-                <w:top w:val="none" w:sz="0" w:space="0" w:color="000000"/>
-                <w:left w:val="none" w:sz="0" w:space="0" w:color="000000"/>
-                <w:right w:val="none" w:sz="0" w:space="0" w:color="000000"/>
-              </w:pBdr>
-              <w:spacing w:after="100" w:before="100" w:line="240"/>
-              <w:ind w:left="100" w:right="100" w:firstLine="0" w:firstLineChars="0"/>
-              <w:rPr>
-                <w:rFonts w:ascii="Arial" w:hAnsi="Arial" w:eastAsia="Arial" w:cs="Arial"/>
-                <w:i w:val="false"/>
-                <w:b w:val="false"/>
-                <w:u w:val="none"/>
-                <w:sz w:val="18"/>
-                <w:szCs w:val="18"/>
-                <w:color w:val="000000"/>
-              </w:rPr>
-            </w:pPr>
-            <w:r>
-              <w:rPr>
-                <w:rFonts w:ascii="Arial" w:hAnsi="Arial" w:eastAsia="Arial" w:cs="Arial"/>
-                <w:i w:val="false"/>
-                <w:b w:val="false"/>
-                <w:u w:val="none"/>
-                <w:sz w:val="18"/>
-                <w:szCs w:val="18"/>
-                <w:color w:val="000000"/>
-              </w:rPr>
-              <w:t xml:space="preserve">6 (25.0%)</w:t>
-            </w:r>
-          </w:p>
-        </w:tc>
-        <w:tc>
-          <w:tcPr>
-            <w:tcBorders>
-              <w:bottom w:val="none" w:sz="0" w:space="0" w:color="000000"/>
-              <w:top w:val="none" w:sz="0" w:space="0" w:color="000000"/>
-              <w:left w:val="none" w:sz="0" w:space="0" w:color="000000"/>
-              <w:right w:val="none" w:sz="0" w:space="0" w:color="000000"/>
-            </w:tcBorders>
-            <w:shd w:val="clear" w:color="auto" w:fill="FFFFFF"/>
-            <w:tcMar>
-              <w:top w:w="0" w:type="dxa"/>
-              <w:bottom w:w="0" w:type="dxa"/>
-              <w:left w:w="0" w:type="dxa"/>
-              <w:right w:w="0" w:type="dxa"/>
-            </w:tcMar>
-            <w:vAlign w:val="center"/>
-          </w:tcPr>
-          <w:p>
-            <w:pPr>
-              <w:jc w:val="left"/>
-              <w:pBdr>
-                <w:bottom w:val="none" w:sz="0" w:space="0" w:color="000000"/>
-                <w:top w:val="none" w:sz="0" w:space="0" w:color="000000"/>
-                <w:left w:val="none" w:sz="0" w:space="0" w:color="000000"/>
-                <w:right w:val="none" w:sz="0" w:space="0" w:color="000000"/>
-              </w:pBdr>
-              <w:spacing w:after="100" w:before="100" w:line="240"/>
-              <w:ind w:left="100" w:right="100" w:firstLine="0" w:firstLineChars="0"/>
-              <w:rPr>
-                <w:rFonts w:ascii="Arial" w:hAnsi="Arial" w:eastAsia="Arial" w:cs="Arial"/>
-                <w:i w:val="false"/>
-                <w:b w:val="false"/>
-                <w:u w:val="none"/>
-                <w:sz w:val="18"/>
-                <w:szCs w:val="18"/>
-                <w:color w:val="000000"/>
-              </w:rPr>
-            </w:pPr>
-            <w:r>
-              <w:rPr>
-                <w:rFonts w:ascii="Arial" w:hAnsi="Arial" w:eastAsia="Arial" w:cs="Arial"/>
-                <w:i w:val="false"/>
-                <w:b w:val="false"/>
-                <w:u w:val="none"/>
-                <w:sz w:val="18"/>
-                <w:szCs w:val="18"/>
-                <w:color w:val="000000"/>
-              </w:rPr>
-              <w:t xml:space="preserve">1 (5.6%)</w:t>
+              <w:t xml:space="preserve">Scalability</w:t>
+            </w:r>
+          </w:p>
+        </w:tc>
+        <w:tc>
+          <w:tcPr>
+            <w:tcBorders>
+              <w:bottom w:val="none" w:sz="0" w:space="0" w:color="000000"/>
+              <w:top w:val="none" w:sz="0" w:space="0" w:color="000000"/>
+              <w:left w:val="none" w:sz="0" w:space="0" w:color="000000"/>
+              <w:right w:val="none" w:sz="0" w:space="0" w:color="000000"/>
+            </w:tcBorders>
+            <w:shd w:val="clear" w:color="auto" w:fill="FFFFFF"/>
+            <w:tcMar>
+              <w:top w:w="0" w:type="dxa"/>
+              <w:bottom w:w="0" w:type="dxa"/>
+              <w:left w:w="0" w:type="dxa"/>
+              <w:right w:w="0" w:type="dxa"/>
+            </w:tcMar>
+            <w:vAlign w:val="center"/>
+          </w:tcPr>
+          <w:p>
+            <w:pPr>
+              <w:jc w:val="left"/>
+              <w:pBdr>
+                <w:bottom w:val="none" w:sz="0" w:space="0" w:color="000000"/>
+                <w:top w:val="none" w:sz="0" w:space="0" w:color="000000"/>
+                <w:left w:val="none" w:sz="0" w:space="0" w:color="000000"/>
+                <w:right w:val="none" w:sz="0" w:space="0" w:color="000000"/>
+              </w:pBdr>
+              <w:spacing w:after="100" w:before="100" w:line="240"/>
+              <w:ind w:left="100" w:right="100" w:firstLine="0" w:firstLineChars="0"/>
+              <w:rPr>
+                <w:rFonts w:ascii="Arial" w:hAnsi="Arial" w:eastAsia="Arial" w:cs="Arial"/>
+                <w:i w:val="false"/>
+                <w:b w:val="false"/>
+                <w:u w:val="none"/>
+                <w:sz w:val="18"/>
+                <w:szCs w:val="18"/>
+                <w:color w:val="000000"/>
+              </w:rPr>
+            </w:pPr>
+            <w:r>
+              <w:rPr>
+                <w:rFonts w:ascii="Arial" w:hAnsi="Arial" w:eastAsia="Arial" w:cs="Arial"/>
+                <w:i w:val="false"/>
+                <w:b w:val="false"/>
+                <w:u w:val="none"/>
+                <w:sz w:val="18"/>
+                <w:szCs w:val="18"/>
+                <w:color w:val="000000"/>
+              </w:rPr>
+              <w:t xml:space="preserve">15 (26.3%)</w:t>
+            </w:r>
+          </w:p>
+        </w:tc>
+        <w:tc>
+          <w:tcPr>
+            <w:tcBorders>
+              <w:bottom w:val="none" w:sz="0" w:space="0" w:color="000000"/>
+              <w:top w:val="none" w:sz="0" w:space="0" w:color="000000"/>
+              <w:left w:val="none" w:sz="0" w:space="0" w:color="000000"/>
+              <w:right w:val="none" w:sz="0" w:space="0" w:color="000000"/>
+            </w:tcBorders>
+            <w:shd w:val="clear" w:color="auto" w:fill="FFFFFF"/>
+            <w:tcMar>
+              <w:top w:w="0" w:type="dxa"/>
+              <w:bottom w:w="0" w:type="dxa"/>
+              <w:left w:w="0" w:type="dxa"/>
+              <w:right w:w="0" w:type="dxa"/>
+            </w:tcMar>
+            <w:vAlign w:val="center"/>
+          </w:tcPr>
+          <w:p>
+            <w:pPr>
+              <w:jc w:val="left"/>
+              <w:pBdr>
+                <w:bottom w:val="none" w:sz="0" w:space="0" w:color="000000"/>
+                <w:top w:val="none" w:sz="0" w:space="0" w:color="000000"/>
+                <w:left w:val="none" w:sz="0" w:space="0" w:color="000000"/>
+                <w:right w:val="none" w:sz="0" w:space="0" w:color="000000"/>
+              </w:pBdr>
+              <w:spacing w:after="100" w:before="100" w:line="240"/>
+              <w:ind w:left="100" w:right="100" w:firstLine="0" w:firstLineChars="0"/>
+              <w:rPr>
+                <w:rFonts w:ascii="Arial" w:hAnsi="Arial" w:eastAsia="Arial" w:cs="Arial"/>
+                <w:i w:val="false"/>
+                <w:b w:val="false"/>
+                <w:u w:val="none"/>
+                <w:sz w:val="18"/>
+                <w:szCs w:val="18"/>
+                <w:color w:val="000000"/>
+              </w:rPr>
+            </w:pPr>
+            <w:r>
+              <w:rPr>
+                <w:rFonts w:ascii="Arial" w:hAnsi="Arial" w:eastAsia="Arial" w:cs="Arial"/>
+                <w:i w:val="false"/>
+                <w:b w:val="false"/>
+                <w:u w:val="none"/>
+                <w:sz w:val="18"/>
+                <w:szCs w:val="18"/>
+                <w:color w:val="000000"/>
+              </w:rPr>
+              <w:t xml:space="preserve">0 (0.0%)</w:t>
+            </w:r>
+          </w:p>
+        </w:tc>
+        <w:tc>
+          <w:tcPr>
+            <w:tcBorders>
+              <w:bottom w:val="none" w:sz="0" w:space="0" w:color="000000"/>
+              <w:top w:val="none" w:sz="0" w:space="0" w:color="000000"/>
+              <w:left w:val="none" w:sz="0" w:space="0" w:color="000000"/>
+              <w:right w:val="none" w:sz="0" w:space="0" w:color="000000"/>
+            </w:tcBorders>
+            <w:shd w:val="clear" w:color="auto" w:fill="FFFFFF"/>
+            <w:tcMar>
+              <w:top w:w="0" w:type="dxa"/>
+              <w:bottom w:w="0" w:type="dxa"/>
+              <w:left w:w="0" w:type="dxa"/>
+              <w:right w:w="0" w:type="dxa"/>
+            </w:tcMar>
+            <w:vAlign w:val="center"/>
+          </w:tcPr>
+          <w:p>
+            <w:pPr>
+              <w:jc w:val="left"/>
+              <w:pBdr>
+                <w:bottom w:val="none" w:sz="0" w:space="0" w:color="000000"/>
+                <w:top w:val="none" w:sz="0" w:space="0" w:color="000000"/>
+                <w:left w:val="none" w:sz="0" w:space="0" w:color="000000"/>
+                <w:right w:val="none" w:sz="0" w:space="0" w:color="000000"/>
+              </w:pBdr>
+              <w:spacing w:after="100" w:before="100" w:line="240"/>
+              <w:ind w:left="100" w:right="100" w:firstLine="0" w:firstLineChars="0"/>
+              <w:rPr>
+                <w:rFonts w:ascii="Arial" w:hAnsi="Arial" w:eastAsia="Arial" w:cs="Arial"/>
+                <w:i w:val="false"/>
+                <w:b w:val="false"/>
+                <w:u w:val="none"/>
+                <w:sz w:val="18"/>
+                <w:szCs w:val="18"/>
+                <w:color w:val="000000"/>
+              </w:rPr>
+            </w:pPr>
+            <w:r>
+              <w:rPr>
+                <w:rFonts w:ascii="Arial" w:hAnsi="Arial" w:eastAsia="Arial" w:cs="Arial"/>
+                <w:i w:val="false"/>
+                <w:b w:val="false"/>
+                <w:u w:val="none"/>
+                <w:sz w:val="18"/>
+                <w:szCs w:val="18"/>
+                <w:color w:val="000000"/>
+              </w:rPr>
+              <w:t xml:space="preserve">13 (29.5%)</w:t>
+            </w:r>
+          </w:p>
+        </w:tc>
+        <w:tc>
+          <w:tcPr>
+            <w:tcBorders>
+              <w:bottom w:val="none" w:sz="0" w:space="0" w:color="000000"/>
+              <w:top w:val="none" w:sz="0" w:space="0" w:color="000000"/>
+              <w:left w:val="none" w:sz="0" w:space="0" w:color="000000"/>
+              <w:right w:val="none" w:sz="0" w:space="0" w:color="000000"/>
+            </w:tcBorders>
+            <w:shd w:val="clear" w:color="auto" w:fill="FFFFFF"/>
+            <w:tcMar>
+              <w:top w:w="0" w:type="dxa"/>
+              <w:bottom w:w="0" w:type="dxa"/>
+              <w:left w:w="0" w:type="dxa"/>
+              <w:right w:w="0" w:type="dxa"/>
+            </w:tcMar>
+            <w:vAlign w:val="center"/>
+          </w:tcPr>
+          <w:p>
+            <w:pPr>
+              <w:jc w:val="left"/>
+              <w:pBdr>
+                <w:bottom w:val="none" w:sz="0" w:space="0" w:color="000000"/>
+                <w:top w:val="none" w:sz="0" w:space="0" w:color="000000"/>
+                <w:left w:val="none" w:sz="0" w:space="0" w:color="000000"/>
+                <w:right w:val="none" w:sz="0" w:space="0" w:color="000000"/>
+              </w:pBdr>
+              <w:spacing w:after="100" w:before="100" w:line="240"/>
+              <w:ind w:left="100" w:right="100" w:firstLine="0" w:firstLineChars="0"/>
+              <w:rPr>
+                <w:rFonts w:ascii="Arial" w:hAnsi="Arial" w:eastAsia="Arial" w:cs="Arial"/>
+                <w:i w:val="false"/>
+                <w:b w:val="false"/>
+                <w:u w:val="none"/>
+                <w:sz w:val="18"/>
+                <w:szCs w:val="18"/>
+                <w:color w:val="000000"/>
+              </w:rPr>
+            </w:pPr>
+            <w:r>
+              <w:rPr>
+                <w:rFonts w:ascii="Arial" w:hAnsi="Arial" w:eastAsia="Arial" w:cs="Arial"/>
+                <w:i w:val="false"/>
+                <w:b w:val="false"/>
+                <w:u w:val="none"/>
+                <w:sz w:val="18"/>
+                <w:szCs w:val="18"/>
+                <w:color w:val="000000"/>
+              </w:rPr>
+              <w:t xml:space="preserve">2 (22.2%)</w:t>
+            </w:r>
+          </w:p>
+        </w:tc>
+        <w:tc>
+          <w:tcPr>
+            <w:tcBorders>
+              <w:bottom w:val="none" w:sz="0" w:space="0" w:color="000000"/>
+              <w:top w:val="none" w:sz="0" w:space="0" w:color="000000"/>
+              <w:left w:val="none" w:sz="0" w:space="0" w:color="000000"/>
+              <w:right w:val="none" w:sz="0" w:space="0" w:color="000000"/>
+            </w:tcBorders>
+            <w:shd w:val="clear" w:color="auto" w:fill="FFFFFF"/>
+            <w:tcMar>
+              <w:top w:w="0" w:type="dxa"/>
+              <w:bottom w:w="0" w:type="dxa"/>
+              <w:left w:w="0" w:type="dxa"/>
+              <w:right w:w="0" w:type="dxa"/>
+            </w:tcMar>
+            <w:vAlign w:val="center"/>
+          </w:tcPr>
+          <w:p>
+            <w:pPr>
+              <w:jc w:val="left"/>
+              <w:pBdr>
+                <w:bottom w:val="none" w:sz="0" w:space="0" w:color="000000"/>
+                <w:top w:val="none" w:sz="0" w:space="0" w:color="000000"/>
+                <w:left w:val="none" w:sz="0" w:space="0" w:color="000000"/>
+                <w:right w:val="none" w:sz="0" w:space="0" w:color="000000"/>
+              </w:pBdr>
+              <w:spacing w:after="100" w:before="100" w:line="240"/>
+              <w:ind w:left="100" w:right="100" w:firstLine="0" w:firstLineChars="0"/>
+              <w:rPr>
+                <w:rFonts w:ascii="Arial" w:hAnsi="Arial" w:eastAsia="Arial" w:cs="Arial"/>
+                <w:i w:val="false"/>
+                <w:b w:val="false"/>
+                <w:u w:val="none"/>
+                <w:sz w:val="18"/>
+                <w:szCs w:val="18"/>
+                <w:color w:val="000000"/>
+              </w:rPr>
+            </w:pPr>
+            <w:r>
+              <w:rPr>
+                <w:rFonts w:ascii="Arial" w:hAnsi="Arial" w:eastAsia="Arial" w:cs="Arial"/>
+                <w:i w:val="false"/>
+                <w:b w:val="false"/>
+                <w:u w:val="none"/>
+                <w:sz w:val="18"/>
+                <w:szCs w:val="18"/>
+                <w:color w:val="000000"/>
+              </w:rPr>
+              <w:t xml:space="preserve">3 (21.4%)</w:t>
+            </w:r>
+          </w:p>
+        </w:tc>
+        <w:tc>
+          <w:tcPr>
+            <w:tcBorders>
+              <w:bottom w:val="none" w:sz="0" w:space="0" w:color="000000"/>
+              <w:top w:val="none" w:sz="0" w:space="0" w:color="000000"/>
+              <w:left w:val="none" w:sz="0" w:space="0" w:color="000000"/>
+              <w:right w:val="none" w:sz="0" w:space="0" w:color="000000"/>
+            </w:tcBorders>
+            <w:shd w:val="clear" w:color="auto" w:fill="FFFFFF"/>
+            <w:tcMar>
+              <w:top w:w="0" w:type="dxa"/>
+              <w:bottom w:w="0" w:type="dxa"/>
+              <w:left w:w="0" w:type="dxa"/>
+              <w:right w:w="0" w:type="dxa"/>
+            </w:tcMar>
+            <w:vAlign w:val="center"/>
+          </w:tcPr>
+          <w:p>
+            <w:pPr>
+              <w:jc w:val="left"/>
+              <w:pBdr>
+                <w:bottom w:val="none" w:sz="0" w:space="0" w:color="000000"/>
+                <w:top w:val="none" w:sz="0" w:space="0" w:color="000000"/>
+                <w:left w:val="none" w:sz="0" w:space="0" w:color="000000"/>
+                <w:right w:val="none" w:sz="0" w:space="0" w:color="000000"/>
+              </w:pBdr>
+              <w:spacing w:after="100" w:before="100" w:line="240"/>
+              <w:ind w:left="100" w:right="100" w:firstLine="0" w:firstLineChars="0"/>
+              <w:rPr>
+                <w:rFonts w:ascii="Arial" w:hAnsi="Arial" w:eastAsia="Arial" w:cs="Arial"/>
+                <w:i w:val="false"/>
+                <w:b w:val="false"/>
+                <w:u w:val="none"/>
+                <w:sz w:val="18"/>
+                <w:szCs w:val="18"/>
+                <w:color w:val="000000"/>
+              </w:rPr>
+            </w:pPr>
+            <w:r>
+              <w:rPr>
+                <w:rFonts w:ascii="Arial" w:hAnsi="Arial" w:eastAsia="Arial" w:cs="Arial"/>
+                <w:i w:val="false"/>
+                <w:b w:val="false"/>
+                <w:u w:val="none"/>
+                <w:sz w:val="18"/>
+                <w:szCs w:val="18"/>
+                <w:color w:val="000000"/>
+              </w:rPr>
+              <w:t xml:space="preserve">7 (28.0%)</w:t>
+            </w:r>
+          </w:p>
+        </w:tc>
+        <w:tc>
+          <w:tcPr>
+            <w:tcBorders>
+              <w:bottom w:val="none" w:sz="0" w:space="0" w:color="000000"/>
+              <w:top w:val="none" w:sz="0" w:space="0" w:color="000000"/>
+              <w:left w:val="none" w:sz="0" w:space="0" w:color="000000"/>
+              <w:right w:val="none" w:sz="0" w:space="0" w:color="000000"/>
+            </w:tcBorders>
+            <w:shd w:val="clear" w:color="auto" w:fill="FFFFFF"/>
+            <w:tcMar>
+              <w:top w:w="0" w:type="dxa"/>
+              <w:bottom w:w="0" w:type="dxa"/>
+              <w:left w:w="0" w:type="dxa"/>
+              <w:right w:w="0" w:type="dxa"/>
+            </w:tcMar>
+            <w:vAlign w:val="center"/>
+          </w:tcPr>
+          <w:p>
+            <w:pPr>
+              <w:jc w:val="left"/>
+              <w:pBdr>
+                <w:bottom w:val="none" w:sz="0" w:space="0" w:color="000000"/>
+                <w:top w:val="none" w:sz="0" w:space="0" w:color="000000"/>
+                <w:left w:val="none" w:sz="0" w:space="0" w:color="000000"/>
+                <w:right w:val="none" w:sz="0" w:space="0" w:color="000000"/>
+              </w:pBdr>
+              <w:spacing w:after="100" w:before="100" w:line="240"/>
+              <w:ind w:left="100" w:right="100" w:firstLine="0" w:firstLineChars="0"/>
+              <w:rPr>
+                <w:rFonts w:ascii="Arial" w:hAnsi="Arial" w:eastAsia="Arial" w:cs="Arial"/>
+                <w:i w:val="false"/>
+                <w:b w:val="false"/>
+                <w:u w:val="none"/>
+                <w:sz w:val="18"/>
+                <w:szCs w:val="18"/>
+                <w:color w:val="000000"/>
+              </w:rPr>
+            </w:pPr>
+            <w:r>
+              <w:rPr>
+                <w:rFonts w:ascii="Arial" w:hAnsi="Arial" w:eastAsia="Arial" w:cs="Arial"/>
+                <w:i w:val="false"/>
+                <w:b w:val="false"/>
+                <w:u w:val="none"/>
+                <w:sz w:val="18"/>
+                <w:szCs w:val="18"/>
+                <w:color w:val="000000"/>
+              </w:rPr>
+              <w:t xml:space="preserve">5 (27.8%)</w:t>
             </w:r>
           </w:p>
         </w:tc>
@@ -8647,371 +8647,371 @@
                 <w:szCs w:val="18"/>
                 <w:color w:val="000000"/>
               </w:rPr>
-              <w:t xml:space="preserve">Scalability</w:t>
-            </w:r>
-          </w:p>
-        </w:tc>
-        <w:tc>
-          <w:tcPr>
-            <w:tcBorders>
-              <w:bottom w:val="none" w:sz="0" w:space="0" w:color="000000"/>
-              <w:top w:val="none" w:sz="0" w:space="0" w:color="000000"/>
-              <w:left w:val="none" w:sz="0" w:space="0" w:color="000000"/>
-              <w:right w:val="none" w:sz="0" w:space="0" w:color="000000"/>
-            </w:tcBorders>
-            <w:shd w:val="clear" w:color="auto" w:fill="FFFFFF"/>
-            <w:tcMar>
-              <w:top w:w="0" w:type="dxa"/>
-              <w:bottom w:w="0" w:type="dxa"/>
-              <w:left w:w="0" w:type="dxa"/>
-              <w:right w:w="0" w:type="dxa"/>
-            </w:tcMar>
-            <w:vAlign w:val="center"/>
-          </w:tcPr>
-          <w:p>
-            <w:pPr>
-              <w:jc w:val="left"/>
-              <w:pBdr>
-                <w:bottom w:val="none" w:sz="0" w:space="0" w:color="000000"/>
-                <w:top w:val="none" w:sz="0" w:space="0" w:color="000000"/>
-                <w:left w:val="none" w:sz="0" w:space="0" w:color="000000"/>
-                <w:right w:val="none" w:sz="0" w:space="0" w:color="000000"/>
-              </w:pBdr>
-              <w:spacing w:after="100" w:before="100" w:line="240"/>
-              <w:ind w:left="100" w:right="100" w:firstLine="0" w:firstLineChars="0"/>
-              <w:rPr>
-                <w:rFonts w:ascii="Arial" w:hAnsi="Arial" w:eastAsia="Arial" w:cs="Arial"/>
-                <w:i w:val="false"/>
-                <w:b w:val="false"/>
-                <w:u w:val="none"/>
-                <w:sz w:val="18"/>
-                <w:szCs w:val="18"/>
-                <w:color w:val="000000"/>
-              </w:rPr>
-            </w:pPr>
-            <w:r>
-              <w:rPr>
-                <w:rFonts w:ascii="Arial" w:hAnsi="Arial" w:eastAsia="Arial" w:cs="Arial"/>
-                <w:i w:val="false"/>
-                <w:b w:val="false"/>
-                <w:u w:val="none"/>
-                <w:sz w:val="18"/>
-                <w:szCs w:val="18"/>
-                <w:color w:val="000000"/>
-              </w:rPr>
-              <w:t xml:space="preserve">14 (25.0%)</w:t>
-            </w:r>
-          </w:p>
-        </w:tc>
-        <w:tc>
-          <w:tcPr>
-            <w:tcBorders>
-              <w:bottom w:val="none" w:sz="0" w:space="0" w:color="000000"/>
-              <w:top w:val="none" w:sz="0" w:space="0" w:color="000000"/>
-              <w:left w:val="none" w:sz="0" w:space="0" w:color="000000"/>
-              <w:right w:val="none" w:sz="0" w:space="0" w:color="000000"/>
-            </w:tcBorders>
-            <w:shd w:val="clear" w:color="auto" w:fill="FFFFFF"/>
-            <w:tcMar>
-              <w:top w:w="0" w:type="dxa"/>
-              <w:bottom w:w="0" w:type="dxa"/>
-              <w:left w:w="0" w:type="dxa"/>
-              <w:right w:w="0" w:type="dxa"/>
-            </w:tcMar>
-            <w:vAlign w:val="center"/>
-          </w:tcPr>
-          <w:p>
-            <w:pPr>
-              <w:jc w:val="left"/>
-              <w:pBdr>
-                <w:bottom w:val="none" w:sz="0" w:space="0" w:color="000000"/>
-                <w:top w:val="none" w:sz="0" w:space="0" w:color="000000"/>
-                <w:left w:val="none" w:sz="0" w:space="0" w:color="000000"/>
-                <w:right w:val="none" w:sz="0" w:space="0" w:color="000000"/>
-              </w:pBdr>
-              <w:spacing w:after="100" w:before="100" w:line="240"/>
-              <w:ind w:left="100" w:right="100" w:firstLine="0" w:firstLineChars="0"/>
-              <w:rPr>
-                <w:rFonts w:ascii="Arial" w:hAnsi="Arial" w:eastAsia="Arial" w:cs="Arial"/>
-                <w:i w:val="false"/>
-                <w:b w:val="false"/>
-                <w:u w:val="none"/>
-                <w:sz w:val="18"/>
-                <w:szCs w:val="18"/>
-                <w:color w:val="000000"/>
-              </w:rPr>
-            </w:pPr>
-            <w:r>
-              <w:rPr>
-                <w:rFonts w:ascii="Arial" w:hAnsi="Arial" w:eastAsia="Arial" w:cs="Arial"/>
-                <w:i w:val="false"/>
-                <w:b w:val="false"/>
-                <w:u w:val="none"/>
-                <w:sz w:val="18"/>
-                <w:szCs w:val="18"/>
-                <w:color w:val="000000"/>
-              </w:rPr>
-              <w:t xml:space="preserve">0 (0.0%)</w:t>
-            </w:r>
-          </w:p>
-        </w:tc>
-        <w:tc>
-          <w:tcPr>
-            <w:tcBorders>
-              <w:bottom w:val="none" w:sz="0" w:space="0" w:color="000000"/>
-              <w:top w:val="none" w:sz="0" w:space="0" w:color="000000"/>
-              <w:left w:val="none" w:sz="0" w:space="0" w:color="000000"/>
-              <w:right w:val="none" w:sz="0" w:space="0" w:color="000000"/>
-            </w:tcBorders>
-            <w:shd w:val="clear" w:color="auto" w:fill="FFFFFF"/>
-            <w:tcMar>
-              <w:top w:w="0" w:type="dxa"/>
-              <w:bottom w:w="0" w:type="dxa"/>
-              <w:left w:w="0" w:type="dxa"/>
-              <w:right w:w="0" w:type="dxa"/>
-            </w:tcMar>
-            <w:vAlign w:val="center"/>
-          </w:tcPr>
-          <w:p>
-            <w:pPr>
-              <w:jc w:val="left"/>
-              <w:pBdr>
-                <w:bottom w:val="none" w:sz="0" w:space="0" w:color="000000"/>
-                <w:top w:val="none" w:sz="0" w:space="0" w:color="000000"/>
-                <w:left w:val="none" w:sz="0" w:space="0" w:color="000000"/>
-                <w:right w:val="none" w:sz="0" w:space="0" w:color="000000"/>
-              </w:pBdr>
-              <w:spacing w:after="100" w:before="100" w:line="240"/>
-              <w:ind w:left="100" w:right="100" w:firstLine="0" w:firstLineChars="0"/>
-              <w:rPr>
-                <w:rFonts w:ascii="Arial" w:hAnsi="Arial" w:eastAsia="Arial" w:cs="Arial"/>
-                <w:i w:val="false"/>
-                <w:b w:val="false"/>
-                <w:u w:val="none"/>
-                <w:sz w:val="18"/>
-                <w:szCs w:val="18"/>
-                <w:color w:val="000000"/>
-              </w:rPr>
-            </w:pPr>
-            <w:r>
-              <w:rPr>
-                <w:rFonts w:ascii="Arial" w:hAnsi="Arial" w:eastAsia="Arial" w:cs="Arial"/>
-                <w:i w:val="false"/>
-                <w:b w:val="false"/>
-                <w:u w:val="none"/>
-                <w:sz w:val="18"/>
-                <w:szCs w:val="18"/>
-                <w:color w:val="000000"/>
-              </w:rPr>
-              <w:t xml:space="preserve">12 (27.9%)</w:t>
-            </w:r>
-          </w:p>
-        </w:tc>
-        <w:tc>
-          <w:tcPr>
-            <w:tcBorders>
-              <w:bottom w:val="none" w:sz="0" w:space="0" w:color="000000"/>
-              <w:top w:val="none" w:sz="0" w:space="0" w:color="000000"/>
-              <w:left w:val="none" w:sz="0" w:space="0" w:color="000000"/>
-              <w:right w:val="none" w:sz="0" w:space="0" w:color="000000"/>
-            </w:tcBorders>
-            <w:shd w:val="clear" w:color="auto" w:fill="FFFFFF"/>
-            <w:tcMar>
-              <w:top w:w="0" w:type="dxa"/>
-              <w:bottom w:w="0" w:type="dxa"/>
-              <w:left w:w="0" w:type="dxa"/>
-              <w:right w:w="0" w:type="dxa"/>
-            </w:tcMar>
-            <w:vAlign w:val="center"/>
-          </w:tcPr>
-          <w:p>
-            <w:pPr>
-              <w:jc w:val="left"/>
-              <w:pBdr>
-                <w:bottom w:val="none" w:sz="0" w:space="0" w:color="000000"/>
-                <w:top w:val="none" w:sz="0" w:space="0" w:color="000000"/>
-                <w:left w:val="none" w:sz="0" w:space="0" w:color="000000"/>
-                <w:right w:val="none" w:sz="0" w:space="0" w:color="000000"/>
-              </w:pBdr>
-              <w:spacing w:after="100" w:before="100" w:line="240"/>
-              <w:ind w:left="100" w:right="100" w:firstLine="0" w:firstLineChars="0"/>
-              <w:rPr>
-                <w:rFonts w:ascii="Arial" w:hAnsi="Arial" w:eastAsia="Arial" w:cs="Arial"/>
-                <w:i w:val="false"/>
-                <w:b w:val="false"/>
-                <w:u w:val="none"/>
-                <w:sz w:val="18"/>
-                <w:szCs w:val="18"/>
-                <w:color w:val="000000"/>
-              </w:rPr>
-            </w:pPr>
-            <w:r>
-              <w:rPr>
-                <w:rFonts w:ascii="Arial" w:hAnsi="Arial" w:eastAsia="Arial" w:cs="Arial"/>
-                <w:i w:val="false"/>
-                <w:b w:val="false"/>
-                <w:u w:val="none"/>
-                <w:sz w:val="18"/>
-                <w:szCs w:val="18"/>
-                <w:color w:val="000000"/>
-              </w:rPr>
-              <w:t xml:space="preserve">2 (22.2%)</w:t>
-            </w:r>
-          </w:p>
-        </w:tc>
-        <w:tc>
-          <w:tcPr>
-            <w:tcBorders>
-              <w:bottom w:val="none" w:sz="0" w:space="0" w:color="000000"/>
-              <w:top w:val="none" w:sz="0" w:space="0" w:color="000000"/>
-              <w:left w:val="none" w:sz="0" w:space="0" w:color="000000"/>
-              <w:right w:val="none" w:sz="0" w:space="0" w:color="000000"/>
-            </w:tcBorders>
-            <w:shd w:val="clear" w:color="auto" w:fill="FFFFFF"/>
-            <w:tcMar>
-              <w:top w:w="0" w:type="dxa"/>
-              <w:bottom w:w="0" w:type="dxa"/>
-              <w:left w:w="0" w:type="dxa"/>
-              <w:right w:w="0" w:type="dxa"/>
-            </w:tcMar>
-            <w:vAlign w:val="center"/>
-          </w:tcPr>
-          <w:p>
-            <w:pPr>
-              <w:jc w:val="left"/>
-              <w:pBdr>
-                <w:bottom w:val="none" w:sz="0" w:space="0" w:color="000000"/>
-                <w:top w:val="none" w:sz="0" w:space="0" w:color="000000"/>
-                <w:left w:val="none" w:sz="0" w:space="0" w:color="000000"/>
-                <w:right w:val="none" w:sz="0" w:space="0" w:color="000000"/>
-              </w:pBdr>
-              <w:spacing w:after="100" w:before="100" w:line="240"/>
-              <w:ind w:left="100" w:right="100" w:firstLine="0" w:firstLineChars="0"/>
-              <w:rPr>
-                <w:rFonts w:ascii="Arial" w:hAnsi="Arial" w:eastAsia="Arial" w:cs="Arial"/>
-                <w:i w:val="false"/>
-                <w:b w:val="false"/>
-                <w:u w:val="none"/>
-                <w:sz w:val="18"/>
-                <w:szCs w:val="18"/>
-                <w:color w:val="000000"/>
-              </w:rPr>
-            </w:pPr>
-            <w:r>
-              <w:rPr>
-                <w:rFonts w:ascii="Arial" w:hAnsi="Arial" w:eastAsia="Arial" w:cs="Arial"/>
-                <w:i w:val="false"/>
-                <w:b w:val="false"/>
-                <w:u w:val="none"/>
-                <w:sz w:val="18"/>
-                <w:szCs w:val="18"/>
-                <w:color w:val="000000"/>
-              </w:rPr>
-              <w:t xml:space="preserve">3 (21.4%)</w:t>
-            </w:r>
-          </w:p>
-        </w:tc>
-        <w:tc>
-          <w:tcPr>
-            <w:tcBorders>
-              <w:bottom w:val="none" w:sz="0" w:space="0" w:color="000000"/>
-              <w:top w:val="none" w:sz="0" w:space="0" w:color="000000"/>
-              <w:left w:val="none" w:sz="0" w:space="0" w:color="000000"/>
-              <w:right w:val="none" w:sz="0" w:space="0" w:color="000000"/>
-            </w:tcBorders>
-            <w:shd w:val="clear" w:color="auto" w:fill="FFFFFF"/>
-            <w:tcMar>
-              <w:top w:w="0" w:type="dxa"/>
-              <w:bottom w:w="0" w:type="dxa"/>
-              <w:left w:w="0" w:type="dxa"/>
-              <w:right w:w="0" w:type="dxa"/>
-            </w:tcMar>
-            <w:vAlign w:val="center"/>
-          </w:tcPr>
-          <w:p>
-            <w:pPr>
-              <w:jc w:val="left"/>
-              <w:pBdr>
-                <w:bottom w:val="none" w:sz="0" w:space="0" w:color="000000"/>
-                <w:top w:val="none" w:sz="0" w:space="0" w:color="000000"/>
-                <w:left w:val="none" w:sz="0" w:space="0" w:color="000000"/>
-                <w:right w:val="none" w:sz="0" w:space="0" w:color="000000"/>
-              </w:pBdr>
-              <w:spacing w:after="100" w:before="100" w:line="240"/>
-              <w:ind w:left="100" w:right="100" w:firstLine="0" w:firstLineChars="0"/>
-              <w:rPr>
-                <w:rFonts w:ascii="Arial" w:hAnsi="Arial" w:eastAsia="Arial" w:cs="Arial"/>
-                <w:i w:val="false"/>
-                <w:b w:val="false"/>
-                <w:u w:val="none"/>
-                <w:sz w:val="18"/>
-                <w:szCs w:val="18"/>
-                <w:color w:val="000000"/>
-              </w:rPr>
-            </w:pPr>
-            <w:r>
-              <w:rPr>
-                <w:rFonts w:ascii="Arial" w:hAnsi="Arial" w:eastAsia="Arial" w:cs="Arial"/>
-                <w:i w:val="false"/>
-                <w:b w:val="false"/>
-                <w:u w:val="none"/>
-                <w:sz w:val="18"/>
-                <w:szCs w:val="18"/>
-                <w:color w:val="000000"/>
-              </w:rPr>
-              <w:t xml:space="preserve">6 (25.0%)</w:t>
-            </w:r>
-          </w:p>
-        </w:tc>
-        <w:tc>
-          <w:tcPr>
-            <w:tcBorders>
-              <w:bottom w:val="none" w:sz="0" w:space="0" w:color="000000"/>
-              <w:top w:val="none" w:sz="0" w:space="0" w:color="000000"/>
-              <w:left w:val="none" w:sz="0" w:space="0" w:color="000000"/>
-              <w:right w:val="none" w:sz="0" w:space="0" w:color="000000"/>
-            </w:tcBorders>
-            <w:shd w:val="clear" w:color="auto" w:fill="FFFFFF"/>
-            <w:tcMar>
-              <w:top w:w="0" w:type="dxa"/>
-              <w:bottom w:w="0" w:type="dxa"/>
-              <w:left w:w="0" w:type="dxa"/>
-              <w:right w:w="0" w:type="dxa"/>
-            </w:tcMar>
-            <w:vAlign w:val="center"/>
-          </w:tcPr>
-          <w:p>
-            <w:pPr>
-              <w:jc w:val="left"/>
-              <w:pBdr>
-                <w:bottom w:val="none" w:sz="0" w:space="0" w:color="000000"/>
-                <w:top w:val="none" w:sz="0" w:space="0" w:color="000000"/>
-                <w:left w:val="none" w:sz="0" w:space="0" w:color="000000"/>
-                <w:right w:val="none" w:sz="0" w:space="0" w:color="000000"/>
-              </w:pBdr>
-              <w:spacing w:after="100" w:before="100" w:line="240"/>
-              <w:ind w:left="100" w:right="100" w:firstLine="0" w:firstLineChars="0"/>
-              <w:rPr>
-                <w:rFonts w:ascii="Arial" w:hAnsi="Arial" w:eastAsia="Arial" w:cs="Arial"/>
-                <w:i w:val="false"/>
-                <w:b w:val="false"/>
-                <w:u w:val="none"/>
-                <w:sz w:val="18"/>
-                <w:szCs w:val="18"/>
-                <w:color w:val="000000"/>
-              </w:rPr>
-            </w:pPr>
-            <w:r>
-              <w:rPr>
-                <w:rFonts w:ascii="Arial" w:hAnsi="Arial" w:eastAsia="Arial" w:cs="Arial"/>
-                <w:i w:val="false"/>
-                <w:b w:val="false"/>
-                <w:u w:val="none"/>
-                <w:sz w:val="18"/>
-                <w:szCs w:val="18"/>
-                <w:color w:val="000000"/>
-              </w:rPr>
-              <w:t xml:space="preserve">5 (27.8%)</w:t>
+              <w:t xml:space="preserve">Accuracy Constraints</w:t>
+            </w:r>
+          </w:p>
+        </w:tc>
+        <w:tc>
+          <w:tcPr>
+            <w:tcBorders>
+              <w:bottom w:val="none" w:sz="0" w:space="0" w:color="000000"/>
+              <w:top w:val="none" w:sz="0" w:space="0" w:color="000000"/>
+              <w:left w:val="none" w:sz="0" w:space="0" w:color="000000"/>
+              <w:right w:val="none" w:sz="0" w:space="0" w:color="000000"/>
+            </w:tcBorders>
+            <w:shd w:val="clear" w:color="auto" w:fill="FFFFFF"/>
+            <w:tcMar>
+              <w:top w:w="0" w:type="dxa"/>
+              <w:bottom w:w="0" w:type="dxa"/>
+              <w:left w:w="0" w:type="dxa"/>
+              <w:right w:w="0" w:type="dxa"/>
+            </w:tcMar>
+            <w:vAlign w:val="center"/>
+          </w:tcPr>
+          <w:p>
+            <w:pPr>
+              <w:jc w:val="left"/>
+              <w:pBdr>
+                <w:bottom w:val="none" w:sz="0" w:space="0" w:color="000000"/>
+                <w:top w:val="none" w:sz="0" w:space="0" w:color="000000"/>
+                <w:left w:val="none" w:sz="0" w:space="0" w:color="000000"/>
+                <w:right w:val="none" w:sz="0" w:space="0" w:color="000000"/>
+              </w:pBdr>
+              <w:spacing w:after="100" w:before="100" w:line="240"/>
+              <w:ind w:left="100" w:right="100" w:firstLine="0" w:firstLineChars="0"/>
+              <w:rPr>
+                <w:rFonts w:ascii="Arial" w:hAnsi="Arial" w:eastAsia="Arial" w:cs="Arial"/>
+                <w:i w:val="false"/>
+                <w:b w:val="false"/>
+                <w:u w:val="none"/>
+                <w:sz w:val="18"/>
+                <w:szCs w:val="18"/>
+                <w:color w:val="000000"/>
+              </w:rPr>
+            </w:pPr>
+            <w:r>
+              <w:rPr>
+                <w:rFonts w:ascii="Arial" w:hAnsi="Arial" w:eastAsia="Arial" w:cs="Arial"/>
+                <w:i w:val="false"/>
+                <w:b w:val="false"/>
+                <w:u w:val="none"/>
+                <w:sz w:val="18"/>
+                <w:szCs w:val="18"/>
+                <w:color w:val="000000"/>
+              </w:rPr>
+              <w:t xml:space="preserve">14 (24.6%)</w:t>
+            </w:r>
+          </w:p>
+        </w:tc>
+        <w:tc>
+          <w:tcPr>
+            <w:tcBorders>
+              <w:bottom w:val="none" w:sz="0" w:space="0" w:color="000000"/>
+              <w:top w:val="none" w:sz="0" w:space="0" w:color="000000"/>
+              <w:left w:val="none" w:sz="0" w:space="0" w:color="000000"/>
+              <w:right w:val="none" w:sz="0" w:space="0" w:color="000000"/>
+            </w:tcBorders>
+            <w:shd w:val="clear" w:color="auto" w:fill="FFFFFF"/>
+            <w:tcMar>
+              <w:top w:w="0" w:type="dxa"/>
+              <w:bottom w:w="0" w:type="dxa"/>
+              <w:left w:w="0" w:type="dxa"/>
+              <w:right w:w="0" w:type="dxa"/>
+            </w:tcMar>
+            <w:vAlign w:val="center"/>
+          </w:tcPr>
+          <w:p>
+            <w:pPr>
+              <w:jc w:val="left"/>
+              <w:pBdr>
+                <w:bottom w:val="none" w:sz="0" w:space="0" w:color="000000"/>
+                <w:top w:val="none" w:sz="0" w:space="0" w:color="000000"/>
+                <w:left w:val="none" w:sz="0" w:space="0" w:color="000000"/>
+                <w:right w:val="none" w:sz="0" w:space="0" w:color="000000"/>
+              </w:pBdr>
+              <w:spacing w:after="100" w:before="100" w:line="240"/>
+              <w:ind w:left="100" w:right="100" w:firstLine="0" w:firstLineChars="0"/>
+              <w:rPr>
+                <w:rFonts w:ascii="Arial" w:hAnsi="Arial" w:eastAsia="Arial" w:cs="Arial"/>
+                <w:i w:val="false"/>
+                <w:b w:val="false"/>
+                <w:u w:val="none"/>
+                <w:sz w:val="18"/>
+                <w:szCs w:val="18"/>
+                <w:color w:val="000000"/>
+              </w:rPr>
+            </w:pPr>
+            <w:r>
+              <w:rPr>
+                <w:rFonts w:ascii="Arial" w:hAnsi="Arial" w:eastAsia="Arial" w:cs="Arial"/>
+                <w:i w:val="false"/>
+                <w:b w:val="false"/>
+                <w:u w:val="none"/>
+                <w:sz w:val="18"/>
+                <w:szCs w:val="18"/>
+                <w:color w:val="000000"/>
+              </w:rPr>
+              <w:t xml:space="preserve">1 (25.0%)</w:t>
+            </w:r>
+          </w:p>
+        </w:tc>
+        <w:tc>
+          <w:tcPr>
+            <w:tcBorders>
+              <w:bottom w:val="none" w:sz="0" w:space="0" w:color="000000"/>
+              <w:top w:val="none" w:sz="0" w:space="0" w:color="000000"/>
+              <w:left w:val="none" w:sz="0" w:space="0" w:color="000000"/>
+              <w:right w:val="none" w:sz="0" w:space="0" w:color="000000"/>
+            </w:tcBorders>
+            <w:shd w:val="clear" w:color="auto" w:fill="FFFFFF"/>
+            <w:tcMar>
+              <w:top w:w="0" w:type="dxa"/>
+              <w:bottom w:w="0" w:type="dxa"/>
+              <w:left w:w="0" w:type="dxa"/>
+              <w:right w:w="0" w:type="dxa"/>
+            </w:tcMar>
+            <w:vAlign w:val="center"/>
+          </w:tcPr>
+          <w:p>
+            <w:pPr>
+              <w:jc w:val="left"/>
+              <w:pBdr>
+                <w:bottom w:val="none" w:sz="0" w:space="0" w:color="000000"/>
+                <w:top w:val="none" w:sz="0" w:space="0" w:color="000000"/>
+                <w:left w:val="none" w:sz="0" w:space="0" w:color="000000"/>
+                <w:right w:val="none" w:sz="0" w:space="0" w:color="000000"/>
+              </w:pBdr>
+              <w:spacing w:after="100" w:before="100" w:line="240"/>
+              <w:ind w:left="100" w:right="100" w:firstLine="0" w:firstLineChars="0"/>
+              <w:rPr>
+                <w:rFonts w:ascii="Arial" w:hAnsi="Arial" w:eastAsia="Arial" w:cs="Arial"/>
+                <w:i w:val="false"/>
+                <w:b w:val="false"/>
+                <w:u w:val="none"/>
+                <w:sz w:val="18"/>
+                <w:szCs w:val="18"/>
+                <w:color w:val="000000"/>
+              </w:rPr>
+            </w:pPr>
+            <w:r>
+              <w:rPr>
+                <w:rFonts w:ascii="Arial" w:hAnsi="Arial" w:eastAsia="Arial" w:cs="Arial"/>
+                <w:i w:val="false"/>
+                <w:b w:val="false"/>
+                <w:u w:val="none"/>
+                <w:sz w:val="18"/>
+                <w:szCs w:val="18"/>
+                <w:color w:val="000000"/>
+              </w:rPr>
+              <w:t xml:space="preserve">12 (27.3%)</w:t>
+            </w:r>
+          </w:p>
+        </w:tc>
+        <w:tc>
+          <w:tcPr>
+            <w:tcBorders>
+              <w:bottom w:val="none" w:sz="0" w:space="0" w:color="000000"/>
+              <w:top w:val="none" w:sz="0" w:space="0" w:color="000000"/>
+              <w:left w:val="none" w:sz="0" w:space="0" w:color="000000"/>
+              <w:right w:val="none" w:sz="0" w:space="0" w:color="000000"/>
+            </w:tcBorders>
+            <w:shd w:val="clear" w:color="auto" w:fill="FFFFFF"/>
+            <w:tcMar>
+              <w:top w:w="0" w:type="dxa"/>
+              <w:bottom w:w="0" w:type="dxa"/>
+              <w:left w:w="0" w:type="dxa"/>
+              <w:right w:w="0" w:type="dxa"/>
+            </w:tcMar>
+            <w:vAlign w:val="center"/>
+          </w:tcPr>
+          <w:p>
+            <w:pPr>
+              <w:jc w:val="left"/>
+              <w:pBdr>
+                <w:bottom w:val="none" w:sz="0" w:space="0" w:color="000000"/>
+                <w:top w:val="none" w:sz="0" w:space="0" w:color="000000"/>
+                <w:left w:val="none" w:sz="0" w:space="0" w:color="000000"/>
+                <w:right w:val="none" w:sz="0" w:space="0" w:color="000000"/>
+              </w:pBdr>
+              <w:spacing w:after="100" w:before="100" w:line="240"/>
+              <w:ind w:left="100" w:right="100" w:firstLine="0" w:firstLineChars="0"/>
+              <w:rPr>
+                <w:rFonts w:ascii="Arial" w:hAnsi="Arial" w:eastAsia="Arial" w:cs="Arial"/>
+                <w:i w:val="false"/>
+                <w:b w:val="false"/>
+                <w:u w:val="none"/>
+                <w:sz w:val="18"/>
+                <w:szCs w:val="18"/>
+                <w:color w:val="000000"/>
+              </w:rPr>
+            </w:pPr>
+            <w:r>
+              <w:rPr>
+                <w:rFonts w:ascii="Arial" w:hAnsi="Arial" w:eastAsia="Arial" w:cs="Arial"/>
+                <w:i w:val="false"/>
+                <w:b w:val="false"/>
+                <w:u w:val="none"/>
+                <w:sz w:val="18"/>
+                <w:szCs w:val="18"/>
+                <w:color w:val="000000"/>
+              </w:rPr>
+              <w:t xml:space="preserve">1 (11.1%)</w:t>
+            </w:r>
+          </w:p>
+        </w:tc>
+        <w:tc>
+          <w:tcPr>
+            <w:tcBorders>
+              <w:bottom w:val="none" w:sz="0" w:space="0" w:color="000000"/>
+              <w:top w:val="none" w:sz="0" w:space="0" w:color="000000"/>
+              <w:left w:val="none" w:sz="0" w:space="0" w:color="000000"/>
+              <w:right w:val="none" w:sz="0" w:space="0" w:color="000000"/>
+            </w:tcBorders>
+            <w:shd w:val="clear" w:color="auto" w:fill="FFFFFF"/>
+            <w:tcMar>
+              <w:top w:w="0" w:type="dxa"/>
+              <w:bottom w:w="0" w:type="dxa"/>
+              <w:left w:w="0" w:type="dxa"/>
+              <w:right w:w="0" w:type="dxa"/>
+            </w:tcMar>
+            <w:vAlign w:val="center"/>
+          </w:tcPr>
+          <w:p>
+            <w:pPr>
+              <w:jc w:val="left"/>
+              <w:pBdr>
+                <w:bottom w:val="none" w:sz="0" w:space="0" w:color="000000"/>
+                <w:top w:val="none" w:sz="0" w:space="0" w:color="000000"/>
+                <w:left w:val="none" w:sz="0" w:space="0" w:color="000000"/>
+                <w:right w:val="none" w:sz="0" w:space="0" w:color="000000"/>
+              </w:pBdr>
+              <w:spacing w:after="100" w:before="100" w:line="240"/>
+              <w:ind w:left="100" w:right="100" w:firstLine="0" w:firstLineChars="0"/>
+              <w:rPr>
+                <w:rFonts w:ascii="Arial" w:hAnsi="Arial" w:eastAsia="Arial" w:cs="Arial"/>
+                <w:i w:val="false"/>
+                <w:b w:val="false"/>
+                <w:u w:val="none"/>
+                <w:sz w:val="18"/>
+                <w:szCs w:val="18"/>
+                <w:color w:val="000000"/>
+              </w:rPr>
+            </w:pPr>
+            <w:r>
+              <w:rPr>
+                <w:rFonts w:ascii="Arial" w:hAnsi="Arial" w:eastAsia="Arial" w:cs="Arial"/>
+                <w:i w:val="false"/>
+                <w:b w:val="false"/>
+                <w:u w:val="none"/>
+                <w:sz w:val="18"/>
+                <w:szCs w:val="18"/>
+                <w:color w:val="000000"/>
+              </w:rPr>
+              <w:t xml:space="preserve">7 (50.0%)</w:t>
+            </w:r>
+          </w:p>
+        </w:tc>
+        <w:tc>
+          <w:tcPr>
+            <w:tcBorders>
+              <w:bottom w:val="none" w:sz="0" w:space="0" w:color="000000"/>
+              <w:top w:val="none" w:sz="0" w:space="0" w:color="000000"/>
+              <w:left w:val="none" w:sz="0" w:space="0" w:color="000000"/>
+              <w:right w:val="none" w:sz="0" w:space="0" w:color="000000"/>
+            </w:tcBorders>
+            <w:shd w:val="clear" w:color="auto" w:fill="FFFFFF"/>
+            <w:tcMar>
+              <w:top w:w="0" w:type="dxa"/>
+              <w:bottom w:w="0" w:type="dxa"/>
+              <w:left w:w="0" w:type="dxa"/>
+              <w:right w:w="0" w:type="dxa"/>
+            </w:tcMar>
+            <w:vAlign w:val="center"/>
+          </w:tcPr>
+          <w:p>
+            <w:pPr>
+              <w:jc w:val="left"/>
+              <w:pBdr>
+                <w:bottom w:val="none" w:sz="0" w:space="0" w:color="000000"/>
+                <w:top w:val="none" w:sz="0" w:space="0" w:color="000000"/>
+                <w:left w:val="none" w:sz="0" w:space="0" w:color="000000"/>
+                <w:right w:val="none" w:sz="0" w:space="0" w:color="000000"/>
+              </w:pBdr>
+              <w:spacing w:after="100" w:before="100" w:line="240"/>
+              <w:ind w:left="100" w:right="100" w:firstLine="0" w:firstLineChars="0"/>
+              <w:rPr>
+                <w:rFonts w:ascii="Arial" w:hAnsi="Arial" w:eastAsia="Arial" w:cs="Arial"/>
+                <w:i w:val="false"/>
+                <w:b w:val="false"/>
+                <w:u w:val="none"/>
+                <w:sz w:val="18"/>
+                <w:szCs w:val="18"/>
+                <w:color w:val="000000"/>
+              </w:rPr>
+            </w:pPr>
+            <w:r>
+              <w:rPr>
+                <w:rFonts w:ascii="Arial" w:hAnsi="Arial" w:eastAsia="Arial" w:cs="Arial"/>
+                <w:i w:val="false"/>
+                <w:b w:val="false"/>
+                <w:u w:val="none"/>
+                <w:sz w:val="18"/>
+                <w:szCs w:val="18"/>
+                <w:color w:val="000000"/>
+              </w:rPr>
+              <w:t xml:space="preserve">6 (24.0%)</w:t>
+            </w:r>
+          </w:p>
+        </w:tc>
+        <w:tc>
+          <w:tcPr>
+            <w:tcBorders>
+              <w:bottom w:val="none" w:sz="0" w:space="0" w:color="000000"/>
+              <w:top w:val="none" w:sz="0" w:space="0" w:color="000000"/>
+              <w:left w:val="none" w:sz="0" w:space="0" w:color="000000"/>
+              <w:right w:val="none" w:sz="0" w:space="0" w:color="000000"/>
+            </w:tcBorders>
+            <w:shd w:val="clear" w:color="auto" w:fill="FFFFFF"/>
+            <w:tcMar>
+              <w:top w:w="0" w:type="dxa"/>
+              <w:bottom w:w="0" w:type="dxa"/>
+              <w:left w:w="0" w:type="dxa"/>
+              <w:right w:w="0" w:type="dxa"/>
+            </w:tcMar>
+            <w:vAlign w:val="center"/>
+          </w:tcPr>
+          <w:p>
+            <w:pPr>
+              <w:jc w:val="left"/>
+              <w:pBdr>
+                <w:bottom w:val="none" w:sz="0" w:space="0" w:color="000000"/>
+                <w:top w:val="none" w:sz="0" w:space="0" w:color="000000"/>
+                <w:left w:val="none" w:sz="0" w:space="0" w:color="000000"/>
+                <w:right w:val="none" w:sz="0" w:space="0" w:color="000000"/>
+              </w:pBdr>
+              <w:spacing w:after="100" w:before="100" w:line="240"/>
+              <w:ind w:left="100" w:right="100" w:firstLine="0" w:firstLineChars="0"/>
+              <w:rPr>
+                <w:rFonts w:ascii="Arial" w:hAnsi="Arial" w:eastAsia="Arial" w:cs="Arial"/>
+                <w:i w:val="false"/>
+                <w:b w:val="false"/>
+                <w:u w:val="none"/>
+                <w:sz w:val="18"/>
+                <w:szCs w:val="18"/>
+                <w:color w:val="000000"/>
+              </w:rPr>
+            </w:pPr>
+            <w:r>
+              <w:rPr>
+                <w:rFonts w:ascii="Arial" w:hAnsi="Arial" w:eastAsia="Arial" w:cs="Arial"/>
+                <w:i w:val="false"/>
+                <w:b w:val="false"/>
+                <w:u w:val="none"/>
+                <w:sz w:val="18"/>
+                <w:szCs w:val="18"/>
+                <w:color w:val="000000"/>
+              </w:rPr>
+              <w:t xml:space="preserve">1 (5.6%)</w:t>
             </w:r>
           </w:p>
         </w:tc>
@@ -9121,7 +9121,7 @@
                 <w:szCs w:val="18"/>
                 <w:color w:val="000000"/>
               </w:rPr>
-              <w:t xml:space="preserve">8 (14.3%)</w:t>
+              <w:t xml:space="preserve">8 (14.0%)</w:t>
             </w:r>
           </w:p>
         </w:tc>
@@ -9225,7 +9225,7 @@
                 <w:szCs w:val="18"/>
                 <w:color w:val="000000"/>
               </w:rPr>
-              <w:t xml:space="preserve">7 (16.3%)</w:t>
+              <w:t xml:space="preserve">7 (15.9%)</w:t>
             </w:r>
           </w:p>
         </w:tc>
@@ -9381,7 +9381,7 @@
                 <w:szCs w:val="18"/>
                 <w:color w:val="000000"/>
               </w:rPr>
-              <w:t xml:space="preserve">3 (12.5%)</w:t>
+              <w:t xml:space="preserve">3 (12.0%)</w:t>
             </w:r>
           </w:p>
         </w:tc>
@@ -9543,7 +9543,7 @@
                 <w:szCs w:val="18"/>
                 <w:color w:val="000000"/>
               </w:rPr>
-              <w:t xml:space="preserve">5 (8.9%)</w:t>
+              <w:t xml:space="preserve">5 (8.8%)</w:t>
             </w:r>
           </w:p>
         </w:tc>
@@ -9647,7 +9647,7 @@
                 <w:szCs w:val="18"/>
                 <w:color w:val="000000"/>
               </w:rPr>
-              <w:t xml:space="preserve">4 (9.3%)</w:t>
+              <w:t xml:space="preserve">4 (9.1%)</w:t>
             </w:r>
           </w:p>
         </w:tc>
@@ -9803,7 +9803,7 @@
                 <w:szCs w:val="18"/>
                 <w:color w:val="000000"/>
               </w:rPr>
-              <w:t xml:space="preserve">2 (8.3%)</w:t>
+              <w:t xml:space="preserve">2 (8.0%)</w:t>
             </w:r>
           </w:p>
         </w:tc>
@@ -9965,7 +9965,7 @@
                 <w:szCs w:val="18"/>
                 <w:color w:val="000000"/>
               </w:rPr>
-              <w:t xml:space="preserve">4 (7.1%)</w:t>
+              <w:t xml:space="preserve">4 (7.0%)</w:t>
             </w:r>
           </w:p>
         </w:tc>
@@ -10069,7 +10069,7 @@
                 <w:szCs w:val="18"/>
                 <w:color w:val="000000"/>
               </w:rPr>
-              <w:t xml:space="preserve">4 (9.3%)</w:t>
+              <w:t xml:space="preserve">4 (9.1%)</w:t>
             </w:r>
           </w:p>
         </w:tc>
@@ -10225,7 +10225,7 @@
                 <w:szCs w:val="18"/>
                 <w:color w:val="000000"/>
               </w:rPr>
-              <w:t xml:space="preserve">2 (8.3%)</w:t>
+              <w:t xml:space="preserve">2 (8.0%)</w:t>
             </w:r>
           </w:p>
         </w:tc>
@@ -10387,7 +10387,7 @@
                 <w:szCs w:val="18"/>
                 <w:color w:val="000000"/>
               </w:rPr>
-              <w:t xml:space="preserve">2 (3.6%)</w:t>
+              <w:t xml:space="preserve">2 (3.5%)</w:t>
             </w:r>
           </w:p>
         </w:tc>
@@ -10491,7 +10491,7 @@
                 <w:szCs w:val="18"/>
                 <w:color w:val="000000"/>
               </w:rPr>
-              <w:t xml:space="preserve">2 (4.7%)</w:t>
+              <w:t xml:space="preserve">2 (4.5%)</w:t>
             </w:r>
           </w:p>
         </w:tc>
@@ -11491,7 +11491,7 @@
                 <w:szCs w:val="18"/>
                 <w:color w:val="000000"/>
               </w:rPr>
-              <w:t xml:space="preserve">1 (4.2%)</w:t>
+              <w:t xml:space="preserve">1 (4.0%)</w:t>
             </w:r>
           </w:p>
         </w:tc>
@@ -11913,7 +11913,7 @@
                 <w:szCs w:val="18"/>
                 <w:color w:val="000000"/>
               </w:rPr>
-              <w:t xml:space="preserve">1 (4.2%)</w:t>
+              <w:t xml:space="preserve">1 (4.0%)</w:t>
             </w:r>
           </w:p>
         </w:tc>
@@ -13179,7 +13179,7 @@
                 <w:szCs w:val="18"/>
                 <w:color w:val="000000"/>
               </w:rPr>
-              <w:t xml:space="preserve">1 (4.2%)</w:t>
+              <w:t xml:space="preserve">1 (4.0%)</w:t>
             </w:r>
           </w:p>
         </w:tc>
@@ -13846,7 +13846,7 @@
                 <w:szCs w:val="18"/>
                 <w:color w:val="000000"/>
               </w:rPr>
-              <w:t xml:space="preserve">14 (25.0%)</w:t>
+              <w:t xml:space="preserve">14 (24.6%)</w:t>
             </w:r>
           </w:p>
         </w:tc>
@@ -13950,7 +13950,7 @@
                 <w:szCs w:val="18"/>
                 <w:color w:val="000000"/>
               </w:rPr>
-              <w:t xml:space="preserve">12 (27.9%)</w:t>
+              <w:t xml:space="preserve">12 (27.3%)</w:t>
             </w:r>
           </w:p>
         </w:tc>
@@ -14106,7 +14106,7 @@
                 <w:szCs w:val="18"/>
                 <w:color w:val="000000"/>
               </w:rPr>
-              <w:t xml:space="preserve">8 (33.3%)</w:t>
+              <w:t xml:space="preserve">8 (32.0%)</w:t>
             </w:r>
           </w:p>
         </w:tc>
@@ -14268,7 +14268,7 @@
                 <w:szCs w:val="18"/>
                 <w:color w:val="000000"/>
               </w:rPr>
-              <w:t xml:space="preserve">13 (23.2%)</w:t>
+              <w:t xml:space="preserve">13 (22.8%)</w:t>
             </w:r>
           </w:p>
         </w:tc>
@@ -14372,7 +14372,7 @@
                 <w:szCs w:val="18"/>
                 <w:color w:val="000000"/>
               </w:rPr>
-              <w:t xml:space="preserve">7 (16.3%)</w:t>
+              <w:t xml:space="preserve">7 (15.9%)</w:t>
             </w:r>
           </w:p>
         </w:tc>
@@ -14528,7 +14528,7 @@
                 <w:szCs w:val="18"/>
                 <w:color w:val="000000"/>
               </w:rPr>
-              <w:t xml:space="preserve">8 (33.3%)</w:t>
+              <w:t xml:space="preserve">8 (32.0%)</w:t>
             </w:r>
           </w:p>
         </w:tc>
@@ -14690,7 +14690,7 @@
                 <w:szCs w:val="18"/>
                 <w:color w:val="000000"/>
               </w:rPr>
-              <w:t xml:space="preserve">8 (14.3%)</w:t>
+              <w:t xml:space="preserve">9 (15.8%)</w:t>
             </w:r>
           </w:p>
         </w:tc>
@@ -14794,7 +14794,7 @@
                 <w:szCs w:val="18"/>
                 <w:color w:val="000000"/>
               </w:rPr>
-              <w:t xml:space="preserve">7 (16.3%)</w:t>
+              <w:t xml:space="preserve">8 (18.2%)</w:t>
             </w:r>
           </w:p>
         </w:tc>
@@ -14950,7 +14950,7 @@
                 <w:szCs w:val="18"/>
                 <w:color w:val="000000"/>
               </w:rPr>
-              <w:t xml:space="preserve">2 (8.3%)</w:t>
+              <w:t xml:space="preserve">3 (12.0%)</w:t>
             </w:r>
           </w:p>
         </w:tc>
@@ -15112,7 +15112,7 @@
                 <w:szCs w:val="18"/>
                 <w:color w:val="000000"/>
               </w:rPr>
-              <w:t xml:space="preserve">6 (10.7%)</w:t>
+              <w:t xml:space="preserve">7 (12.3%)</w:t>
             </w:r>
           </w:p>
         </w:tc>
@@ -15216,7 +15216,7 @@
                 <w:szCs w:val="18"/>
                 <w:color w:val="000000"/>
               </w:rPr>
-              <w:t xml:space="preserve">6 (14.0%)</w:t>
+              <w:t xml:space="preserve">7 (15.9%)</w:t>
             </w:r>
           </w:p>
         </w:tc>
@@ -15372,7 +15372,7 @@
                 <w:szCs w:val="18"/>
                 <w:color w:val="000000"/>
               </w:rPr>
-              <w:t xml:space="preserve">2 (8.3%)</w:t>
+              <w:t xml:space="preserve">3 (12.0%)</w:t>
             </w:r>
           </w:p>
         </w:tc>
@@ -15534,7 +15534,7 @@
                 <w:szCs w:val="18"/>
                 <w:color w:val="000000"/>
               </w:rPr>
-              <w:t xml:space="preserve">5 (8.9%)</w:t>
+              <w:t xml:space="preserve">5 (8.8%)</w:t>
             </w:r>
           </w:p>
         </w:tc>
@@ -15794,7 +15794,7 @@
                 <w:szCs w:val="18"/>
                 <w:color w:val="000000"/>
               </w:rPr>
-              <w:t xml:space="preserve">1 (4.2%)</w:t>
+              <w:t xml:space="preserve">1 (4.0%)</w:t>
             </w:r>
           </w:p>
         </w:tc>
@@ -15956,7 +15956,7 @@
                 <w:szCs w:val="18"/>
                 <w:color w:val="000000"/>
               </w:rPr>
-              <w:t xml:space="preserve">4 (7.1%)</w:t>
+              <w:t xml:space="preserve">4 (7.0%)</w:t>
             </w:r>
           </w:p>
         </w:tc>
@@ -16060,7 +16060,7 @@
                 <w:szCs w:val="18"/>
                 <w:color w:val="000000"/>
               </w:rPr>
-              <w:t xml:space="preserve">3 (7.0%)</w:t>
+              <w:t xml:space="preserve">3 (6.8%)</w:t>
             </w:r>
           </w:p>
         </w:tc>
@@ -16378,7 +16378,7 @@
                 <w:szCs w:val="18"/>
                 <w:color w:val="000000"/>
               </w:rPr>
-              <w:t xml:space="preserve">3 (5.4%)</w:t>
+              <w:t xml:space="preserve">3 (5.3%)</w:t>
             </w:r>
           </w:p>
         </w:tc>
@@ -16482,7 +16482,7 @@
                 <w:szCs w:val="18"/>
                 <w:color w:val="000000"/>
               </w:rPr>
-              <w:t xml:space="preserve">3 (7.0%)</w:t>
+              <w:t xml:space="preserve">3 (6.8%)</w:t>
             </w:r>
           </w:p>
         </w:tc>
@@ -16638,7 +16638,7 @@
                 <w:szCs w:val="18"/>
                 <w:color w:val="000000"/>
               </w:rPr>
-              <w:t xml:space="preserve">1 (4.2%)</w:t>
+              <w:t xml:space="preserve">1 (4.0%)</w:t>
             </w:r>
           </w:p>
         </w:tc>
@@ -16800,7 +16800,7 @@
                 <w:szCs w:val="18"/>
                 <w:color w:val="000000"/>
               </w:rPr>
-              <w:t xml:space="preserve">3 (5.4%)</w:t>
+              <w:t xml:space="preserve">3 (5.3%)</w:t>
             </w:r>
           </w:p>
         </w:tc>
@@ -17060,7 +17060,7 @@
                 <w:szCs w:val="18"/>
                 <w:color w:val="000000"/>
               </w:rPr>
-              <w:t xml:space="preserve">3 (12.5%)</w:t>
+              <w:t xml:space="preserve">3 (12.0%)</w:t>
             </w:r>
           </w:p>
         </w:tc>
@@ -17222,7 +17222,7 @@
                 <w:szCs w:val="18"/>
                 <w:color w:val="000000"/>
               </w:rPr>
-              <w:t xml:space="preserve">3 (5.4%)</w:t>
+              <w:t xml:space="preserve">3 (5.3%)</w:t>
             </w:r>
           </w:p>
         </w:tc>
@@ -17326,7 +17326,7 @@
                 <w:szCs w:val="18"/>
                 <w:color w:val="000000"/>
               </w:rPr>
-              <w:t xml:space="preserve">2 (4.7%)</w:t>
+              <w:t xml:space="preserve">2 (4.5%)</w:t>
             </w:r>
           </w:p>
         </w:tc>
@@ -17482,7 +17482,7 @@
                 <w:szCs w:val="18"/>
                 <w:color w:val="000000"/>
               </w:rPr>
-              <w:t xml:space="preserve">1 (4.2%)</w:t>
+              <w:t xml:space="preserve">1 (4.0%)</w:t>
             </w:r>
           </w:p>
         </w:tc>
@@ -17644,7 +17644,7 @@
                 <w:szCs w:val="18"/>
                 <w:color w:val="000000"/>
               </w:rPr>
-              <w:t xml:space="preserve">3 (5.4%)</w:t>
+              <w:t xml:space="preserve">3 (5.3%)</w:t>
             </w:r>
           </w:p>
         </w:tc>
@@ -17904,7 +17904,7 @@
                 <w:szCs w:val="18"/>
                 <w:color w:val="000000"/>
               </w:rPr>
-              <w:t xml:space="preserve">1 (4.2%)</w:t>
+              <w:t xml:space="preserve">1 (4.0%)</w:t>
             </w:r>
           </w:p>
         </w:tc>
@@ -18066,7 +18066,7 @@
                 <w:szCs w:val="18"/>
                 <w:color w:val="000000"/>
               </w:rPr>
-              <w:t xml:space="preserve">3 (5.4%)</w:t>
+              <w:t xml:space="preserve">3 (5.3%)</w:t>
             </w:r>
           </w:p>
         </w:tc>
@@ -18170,7 +18170,7 @@
                 <w:szCs w:val="18"/>
                 <w:color w:val="000000"/>
               </w:rPr>
-              <w:t xml:space="preserve">3 (7.0%)</w:t>
+              <w:t xml:space="preserve">3 (6.8%)</w:t>
             </w:r>
           </w:p>
         </w:tc>
@@ -18326,7 +18326,7 @@
                 <w:szCs w:val="18"/>
                 <w:color w:val="000000"/>
               </w:rPr>
-              <w:t xml:space="preserve">1 (4.2%)</w:t>
+              <w:t xml:space="preserve">1 (4.0%)</w:t>
             </w:r>
           </w:p>
         </w:tc>
@@ -18488,7 +18488,7 @@
                 <w:szCs w:val="18"/>
                 <w:color w:val="000000"/>
               </w:rPr>
-              <w:t xml:space="preserve">3 (5.4%)</w:t>
+              <w:t xml:space="preserve">3 (5.3%)</w:t>
             </w:r>
           </w:p>
         </w:tc>
@@ -18748,7 +18748,7 @@
                 <w:szCs w:val="18"/>
                 <w:color w:val="000000"/>
               </w:rPr>
-              <w:t xml:space="preserve">1 (4.2%)</w:t>
+              <w:t xml:space="preserve">1 (4.0%)</w:t>
             </w:r>
           </w:p>
         </w:tc>
@@ -18910,7 +18910,7 @@
                 <w:szCs w:val="18"/>
                 <w:color w:val="000000"/>
               </w:rPr>
-              <w:t xml:space="preserve">2 (3.6%)</w:t>
+              <w:t xml:space="preserve">2 (3.5%)</w:t>
             </w:r>
           </w:p>
         </w:tc>
@@ -19014,7 +19014,7 @@
                 <w:szCs w:val="18"/>
                 <w:color w:val="000000"/>
               </w:rPr>
-              <w:t xml:space="preserve">2 (4.7%)</w:t>
+              <w:t xml:space="preserve">2 (4.5%)</w:t>
             </w:r>
           </w:p>
         </w:tc>
@@ -19170,7 +19170,7 @@
                 <w:szCs w:val="18"/>
                 <w:color w:val="000000"/>
               </w:rPr>
-              <w:t xml:space="preserve">1 (4.2%)</w:t>
+              <w:t xml:space="preserve">1 (4.0%)</w:t>
             </w:r>
           </w:p>
         </w:tc>
@@ -19332,7 +19332,7 @@
                 <w:szCs w:val="18"/>
                 <w:color w:val="000000"/>
               </w:rPr>
-              <w:t xml:space="preserve">2 (3.6%)</w:t>
+              <w:t xml:space="preserve">2 (3.5%)</w:t>
             </w:r>
           </w:p>
         </w:tc>
@@ -19592,7 +19592,7 @@
                 <w:szCs w:val="18"/>
                 <w:color w:val="000000"/>
               </w:rPr>
-              <w:t xml:space="preserve">1 (4.2%)</w:t>
+              <w:t xml:space="preserve">1 (4.0%)</w:t>
             </w:r>
           </w:p>
         </w:tc>
@@ -19754,7 +19754,7 @@
                 <w:szCs w:val="18"/>
                 <w:color w:val="000000"/>
               </w:rPr>
-              <w:t xml:space="preserve">2 (3.6%)</w:t>
+              <w:t xml:space="preserve">2 (3.5%)</w:t>
             </w:r>
           </w:p>
         </w:tc>
@@ -20176,7 +20176,7 @@
                 <w:szCs w:val="18"/>
                 <w:color w:val="000000"/>
               </w:rPr>
-              <w:t xml:space="preserve">2 (3.6%)</w:t>
+              <w:t xml:space="preserve">2 (3.5%)</w:t>
             </w:r>
           </w:p>
         </w:tc>
@@ -20858,7 +20858,7 @@
                 <w:szCs w:val="18"/>
                 <w:color w:val="000000"/>
               </w:rPr>
-              <w:t xml:space="preserve">1 (4.2%)</w:t>
+              <w:t xml:space="preserve">1 (4.0%)</w:t>
             </w:r>
           </w:p>
         </w:tc>
@@ -21280,7 +21280,7 @@
                 <w:szCs w:val="18"/>
                 <w:color w:val="000000"/>
               </w:rPr>
-              <w:t xml:space="preserve">1 (4.2%)</w:t>
+              <w:t xml:space="preserve">1 (4.0%)</w:t>
             </w:r>
           </w:p>
         </w:tc>

</xml_diff>